<commit_message>
Reorganize project structure, add .gitignore, update docs
</commit_message>
<xml_diff>
--- a/Thuyết minh _ Trình bày/12 - CNCD2211024-.docx
+++ b/Thuyết minh _ Trình bày/12 - CNCD2211024-.docx
@@ -17851,7 +17851,7 @@
     </w:p>
     <w:p>
       <w:pPr>
-        <w:spacing w:after="0" w:line="312" w:lineRule="auto"/>
+        <w:spacing w:line="312" w:lineRule="auto"/>
         <w:jc w:val="both"/>
         <w:rPr>
           <w:b/>
@@ -24089,7 +24089,7 @@
     </w:p>
     <w:p>
       <w:pPr>
-        <w:spacing w:after="0" w:line="312" w:lineRule="auto"/>
+        <w:spacing w:line="312" w:lineRule="auto"/>
         <w:jc w:val="both"/>
         <w:rPr>
           <w:rFonts w:cs="Times New Roman"/>
@@ -24183,7 +24183,7 @@
     <w:p>
       <w:pPr>
         <w:widowControl w:val="0"/>
-        <w:spacing w:after="0" w:line="312" w:lineRule="auto"/>
+        <w:spacing w:line="312" w:lineRule="auto"/>
         <w:jc w:val="both"/>
         <w:rPr>
           <w:b/>
@@ -24248,6 +24248,7 @@
         <w:rPr>
           <w:lang w:val="en-US" w:eastAsia="vi-VN"/>
         </w:rPr>
+        <w:lastRenderedPageBreak/>
         <w:t>Nghiên</w:t>
       </w:r>
       <w:proofErr w:type="spellEnd"/>
@@ -24430,7 +24431,6 @@
         <w:rPr>
           <w:lang w:val="en-US" w:eastAsia="vi-VN"/>
         </w:rPr>
-        <w:lastRenderedPageBreak/>
         <w:t>bậc</w:t>
       </w:r>
       <w:proofErr w:type="spellEnd"/>
@@ -27226,6 +27226,104 @@
         <w:rPr>
           <w:lang w:val="en-US" w:eastAsia="vi-VN"/>
         </w:rPr>
+        <w:t xml:space="preserve"> </w:t>
+      </w:r>
+      <w:proofErr w:type="spellStart"/>
+      <w:r>
+        <w:rPr>
+          <w:lang w:val="en-US" w:eastAsia="vi-VN"/>
+        </w:rPr>
+        <w:t>đối</w:t>
+      </w:r>
+      <w:proofErr w:type="spellEnd"/>
+      <w:r>
+        <w:rPr>
+          <w:lang w:val="en-US" w:eastAsia="vi-VN"/>
+        </w:rPr>
+        <w:t xml:space="preserve"> </w:t>
+      </w:r>
+      <w:proofErr w:type="spellStart"/>
+      <w:r>
+        <w:rPr>
+          <w:lang w:val="en-US" w:eastAsia="vi-VN"/>
+        </w:rPr>
+        <w:t>với</w:t>
+      </w:r>
+      <w:proofErr w:type="spellEnd"/>
+      <w:r>
+        <w:rPr>
+          <w:lang w:val="en-US" w:eastAsia="vi-VN"/>
+        </w:rPr>
+        <w:t xml:space="preserve"> </w:t>
+      </w:r>
+      <w:proofErr w:type="spellStart"/>
+      <w:r>
+        <w:rPr>
+          <w:lang w:val="en-US" w:eastAsia="vi-VN"/>
+        </w:rPr>
+        <w:t>các</w:t>
+      </w:r>
+      <w:proofErr w:type="spellEnd"/>
+      <w:r>
+        <w:rPr>
+          <w:lang w:val="en-US" w:eastAsia="vi-VN"/>
+        </w:rPr>
+        <w:t xml:space="preserve"> </w:t>
+      </w:r>
+      <w:proofErr w:type="spellStart"/>
+      <w:r>
+        <w:rPr>
+          <w:lang w:val="en-US" w:eastAsia="vi-VN"/>
+        </w:rPr>
+        <w:t>dạng</w:t>
+      </w:r>
+      <w:proofErr w:type="spellEnd"/>
+      <w:r>
+        <w:rPr>
+          <w:lang w:val="en-US" w:eastAsia="vi-VN"/>
+        </w:rPr>
+        <w:t xml:space="preserve"> </w:t>
+      </w:r>
+      <w:proofErr w:type="spellStart"/>
+      <w:r>
+        <w:rPr>
+          <w:lang w:val="en-US" w:eastAsia="vi-VN"/>
+        </w:rPr>
+        <w:t>toán</w:t>
+      </w:r>
+      <w:proofErr w:type="spellEnd"/>
+      <w:r>
+        <w:rPr>
+          <w:lang w:val="en-US" w:eastAsia="vi-VN"/>
+        </w:rPr>
+        <w:t xml:space="preserve"> </w:t>
+      </w:r>
+      <w:proofErr w:type="spellStart"/>
+      <w:r>
+        <w:rPr>
+          <w:lang w:val="en-US" w:eastAsia="vi-VN"/>
+        </w:rPr>
+        <w:t>phân</w:t>
+      </w:r>
+      <w:proofErr w:type="spellEnd"/>
+      <w:r>
+        <w:rPr>
+          <w:lang w:val="en-US" w:eastAsia="vi-VN"/>
+        </w:rPr>
+        <w:t xml:space="preserve"> </w:t>
+      </w:r>
+      <w:proofErr w:type="spellStart"/>
+      <w:r>
+        <w:rPr>
+          <w:lang w:val="en-US" w:eastAsia="vi-VN"/>
+        </w:rPr>
+        <w:t>loại</w:t>
+      </w:r>
+      <w:proofErr w:type="spellEnd"/>
+      <w:r>
+        <w:rPr>
+          <w:lang w:val="en-US" w:eastAsia="vi-VN"/>
+        </w:rPr>
         <w:t>.</w:t>
       </w:r>
     </w:p>
@@ -29296,7 +29394,16 @@
           <w:szCs w:val="26"/>
           <w:lang w:val="en-US"/>
         </w:rPr>
-        <w:t xml:space="preserve"> (singularities).</w:t>
+        <w:t xml:space="preserve"> </w:t>
+      </w:r>
+      <w:r>
+        <w:rPr>
+          <w:color w:val="000000" w:themeColor="text1"/>
+          <w:szCs w:val="26"/>
+          <w:lang w:val="en-US"/>
+        </w:rPr>
+        <w:lastRenderedPageBreak/>
+        <w:t>(singularities).</w:t>
       </w:r>
     </w:p>
     <w:p>
@@ -29316,7 +29423,6 @@
           <w:szCs w:val="26"/>
           <w:lang w:val="en-US"/>
         </w:rPr>
-        <w:lastRenderedPageBreak/>
         <w:t xml:space="preserve">Phan Gia </w:t>
       </w:r>
       <w:proofErr w:type="spellStart"/>
@@ -31652,7 +31758,7 @@
     <w:p>
       <w:pPr>
         <w:widowControl w:val="0"/>
-        <w:spacing w:after="0" w:line="312" w:lineRule="auto"/>
+        <w:spacing w:line="312" w:lineRule="auto"/>
         <w:jc w:val="both"/>
         <w:rPr>
           <w:rFonts w:cs="Times New Roman"/>
@@ -31790,7 +31896,7 @@
     </w:p>
     <w:p>
       <w:pPr>
-        <w:spacing w:after="0" w:line="312" w:lineRule="auto"/>
+        <w:spacing w:line="312" w:lineRule="auto"/>
         <w:jc w:val="both"/>
         <w:rPr>
           <w:rFonts w:cs="Times New Roman"/>
@@ -32599,7 +32705,7 @@
     </w:p>
     <w:p>
       <w:pPr>
-        <w:spacing w:after="0" w:line="312" w:lineRule="auto"/>
+        <w:spacing w:line="312" w:lineRule="auto"/>
         <w:jc w:val="both"/>
         <w:rPr>
           <w:rFonts w:cs="Times New Roman"/>
@@ -33655,7 +33761,7 @@
     </w:p>
     <w:p>
       <w:pPr>
-        <w:spacing w:after="0" w:line="312" w:lineRule="auto"/>
+        <w:spacing w:line="312" w:lineRule="auto"/>
         <w:jc w:val="both"/>
         <w:rPr>
           <w:rFonts w:cs="Times New Roman"/>
@@ -33743,7 +33849,7 @@
         <w:keepNext w:val="0"/>
         <w:keepLines w:val="0"/>
         <w:widowControl w:val="0"/>
-        <w:spacing w:before="0" w:line="312" w:lineRule="auto"/>
+        <w:spacing w:before="0" w:after="160" w:line="312" w:lineRule="auto"/>
         <w:rPr>
           <w:rFonts w:cs="Times New Roman"/>
           <w:b w:val="0"/>
@@ -33818,6 +33924,7 @@
           <w:color w:val="000000" w:themeColor="text1"/>
           <w:lang w:val="nl-NL"/>
         </w:rPr>
+        <w:lastRenderedPageBreak/>
         <w:t>Thu thập, phân tích và tổng hợp các tài liệu học thuật, giáo trình, bài báo khoa học về động học robot song song, cơ sở truyền động cơ khí.</w:t>
       </w:r>
     </w:p>
@@ -33844,23 +33951,13 @@
           <w:color w:val="000000" w:themeColor="text1"/>
           <w:lang w:val="nl-NL"/>
         </w:rPr>
-        <w:t xml:space="preserve">Nghiên cứu lý thuyết về thị giác máy tính, nhận dạng mẫu và các thuật toán nội suy </w:t>
-      </w:r>
-      <w:r>
-        <w:rPr>
-          <w:rFonts w:eastAsiaTheme="minorHAnsi" w:cstheme="minorBidi"/>
-          <w:b w:val="0"/>
-          <w:color w:val="000000" w:themeColor="text1"/>
-          <w:lang w:val="nl-NL"/>
-        </w:rPr>
-        <w:lastRenderedPageBreak/>
-        <w:t>quỹ đạo trong điều khiển tự động.</w:t>
+        <w:t>Nghiên cứu lý thuyết về thị giác máy tính, nhận dạng mẫu và các thuật toán nội suy quỹ đạo trong điều khiển tự động.</w:t>
       </w:r>
     </w:p>
     <w:p>
       <w:pPr>
         <w:pStyle w:val="Heading2"/>
-        <w:spacing w:before="0" w:line="312" w:lineRule="auto"/>
+        <w:spacing w:before="0" w:after="240" w:line="312" w:lineRule="auto"/>
         <w:rPr>
           <w:rFonts w:cs="Times New Roman"/>
           <w:b w:val="0"/>
@@ -34005,7 +34102,7 @@
     <w:p>
       <w:pPr>
         <w:widowControl w:val="0"/>
-        <w:spacing w:after="0" w:line="360" w:lineRule="auto"/>
+        <w:spacing w:line="360" w:lineRule="auto"/>
         <w:jc w:val="both"/>
         <w:rPr>
           <w:rFonts w:cs="Times New Roman"/>
@@ -35414,6 +35511,7 @@
           <w:szCs w:val="26"/>
           <w:lang w:val="vi-VN"/>
         </w:rPr>
+        <w:lastRenderedPageBreak/>
         <w:t xml:space="preserve">7. </w:t>
       </w:r>
       <w:proofErr w:type="spellStart"/>
@@ -36035,7 +36133,6 @@
           <w:rFonts w:cs="Times New Roman"/>
           <w:szCs w:val="26"/>
         </w:rPr>
-        <w:lastRenderedPageBreak/>
         <w:t>Đánh</w:t>
       </w:r>
       <w:proofErr w:type="spellEnd"/>
@@ -37713,14 +37810,7 @@
         <w:i/>
         <w:lang w:val="vi-VN"/>
       </w:rPr>
-      <w:t xml:space="preserve">Đề cương </w:t>
-    </w:r>
-    <w:r>
-      <w:rPr>
-        <w:i/>
-        <w:lang w:val="vi-VN"/>
-      </w:rPr>
-      <w:t xml:space="preserve">chi tiết </w:t>
+      <w:t xml:space="preserve">Đề cương chi tiết </w:t>
     </w:r>
     <w:r>
       <w:rPr>

</xml_diff>